<commit_message>
New chapter from Van de Wall.
</commit_message>
<xml_diff>
--- a/chapters/vandewall.docx
+++ b/chapters/vandewall.docx
@@ -3979,14 +3979,51 @@
           <w:rFonts w:ascii="Calibri" w:hAnsi="Calibri" w:cs="Calibri"/>
           <w:lang w:val="en-GB"/>
         </w:rPr>
-        <w:t xml:space="preserve">. </w:t>
-      </w:r>
-      <w:r>
-        <w:rPr>
-          <w:rFonts w:ascii="Calibri" w:hAnsi="Calibri" w:cs="Calibri"/>
-          <w:lang w:val="en-GB"/>
-        </w:rPr>
-        <w:t>Ancient Greek philosophy was an example of immanence</w:t>
+        <w:t>.</w:t>
+      </w:r>
+      <w:r>
+        <w:rPr>
+          <w:rFonts w:ascii="Calibri" w:hAnsi="Calibri" w:cs="Calibri"/>
+          <w:lang w:val="en-GB"/>
+        </w:rPr>
+        <w:t xml:space="preserve"> </w:t>
+      </w:r>
+      <w:proofErr w:type="spellStart"/>
+      <w:r>
+        <w:rPr>
+          <w:rFonts w:ascii="Calibri" w:hAnsi="Calibri" w:cs="Calibri"/>
+          <w:lang w:val="en-GB"/>
+        </w:rPr>
+        <w:t>Dooyeweerd’s</w:t>
+      </w:r>
+      <w:proofErr w:type="spellEnd"/>
+      <w:r>
+        <w:rPr>
+          <w:rFonts w:ascii="Calibri" w:hAnsi="Calibri" w:cs="Calibri"/>
+          <w:lang w:val="en-GB"/>
+        </w:rPr>
+        <w:t xml:space="preserve"> use of these terms, influenced by his Calvinist perspective, is not uncontroversial. In his view, </w:t>
+      </w:r>
+      <w:r>
+        <w:rPr>
+          <w:rFonts w:ascii="Calibri" w:hAnsi="Calibri" w:cs="Calibri"/>
+          <w:lang w:val="en-GB"/>
+        </w:rPr>
+        <w:t xml:space="preserve">Ancient Greek philosophy </w:t>
+      </w:r>
+      <w:r>
+        <w:rPr>
+          <w:rFonts w:ascii="Calibri" w:hAnsi="Calibri" w:cs="Calibri"/>
+          <w:lang w:val="en-GB"/>
+        </w:rPr>
+        <w:t>in all its variants should be understood as an</w:t>
+      </w:r>
+      <w:r>
+        <w:rPr>
+          <w:rFonts w:ascii="Calibri" w:hAnsi="Calibri" w:cs="Calibri"/>
+          <w:lang w:val="en-GB"/>
+        </w:rPr>
+        <w:t xml:space="preserve"> example of immanence</w:t>
       </w:r>
       <w:r>
         <w:rPr>
@@ -4000,7 +4037,7 @@
           <w:rFonts w:ascii="Calibri" w:hAnsi="Calibri" w:cs="Calibri"/>
           <w:lang w:val="en-GB"/>
         </w:rPr>
-        <w:t>philosophy. This goes for all variants of Greek thought, as the central motive consisted in the absolutization of human theoretical thought</w:t>
+        <w:t>philosophy, as the central motive consisted in the absolutization of human theoretical thought</w:t>
       </w:r>
       <w:r>
         <w:rPr>
@@ -4073,7 +4110,28 @@
           <w:rFonts w:ascii="Calibri" w:hAnsi="Calibri" w:cs="Calibri"/>
           <w:lang w:val="en-GB"/>
         </w:rPr>
-        <w:t xml:space="preserve"> Christianity</w:t>
+        <w:t xml:space="preserve"> </w:t>
+      </w:r>
+      <w:r>
+        <w:rPr>
+          <w:rFonts w:ascii="Calibri" w:hAnsi="Calibri" w:cs="Calibri"/>
+          <w:lang w:val="en-GB"/>
+        </w:rPr>
+        <w:t xml:space="preserve">It was only </w:t>
+      </w:r>
+      <w:r>
+        <w:rPr>
+          <w:rFonts w:ascii="Calibri" w:hAnsi="Calibri" w:cs="Calibri"/>
+          <w:lang w:val="en-GB"/>
+        </w:rPr>
+        <w:t>Christianity</w:t>
+      </w:r>
+      <w:r>
+        <w:rPr>
+          <w:rFonts w:ascii="Calibri" w:hAnsi="Calibri" w:cs="Calibri"/>
+          <w:lang w:val="en-GB"/>
+        </w:rPr>
+        <w:t xml:space="preserve"> that</w:t>
       </w:r>
       <w:r>
         <w:rPr>
@@ -4262,7 +4320,15 @@
           <w:rFonts w:ascii="Calibri" w:hAnsi="Calibri" w:cs="Calibri"/>
           <w:lang w:val="en-GB"/>
         </w:rPr>
-        <w:t xml:space="preserve">o the Reformation. At the same time, the Greek part of the synthesis became the foundation of another, </w:t>
+        <w:t xml:space="preserve">o the Reformation. At the same time, the Greek part of the synthesis became the foundation of </w:t>
+      </w:r>
+      <w:r>
+        <w:rPr>
+          <w:rFonts w:ascii="Calibri" w:hAnsi="Calibri" w:cs="Calibri"/>
+          <w:lang w:val="en-GB"/>
+        </w:rPr>
+        <w:lastRenderedPageBreak/>
+        <w:t xml:space="preserve">another, </w:t>
       </w:r>
       <w:r>
         <w:rPr>
@@ -4313,7 +4379,6 @@
           <w:rFonts w:ascii="Calibri" w:hAnsi="Calibri" w:cs="Calibri"/>
           <w:lang w:val="en-GB"/>
         </w:rPr>
-        <w:lastRenderedPageBreak/>
         <w:t>Dooyeweerd</w:t>
       </w:r>
       <w:proofErr w:type="spellEnd"/>
@@ -5812,7 +5877,15 @@
           <w:rFonts w:ascii="Calibri" w:hAnsi="Calibri" w:cs="Calibri"/>
           <w:lang w:val="en-GB"/>
         </w:rPr>
-        <w:t xml:space="preserve"> should “furnish us with a theoretical insight into the inter-modal coherence of all the aspects of the temporal world”.</w:t>
+        <w:t xml:space="preserve"> should “furnish us with a theoretical insight into the inter-modal coherence of all the aspects </w:t>
+      </w:r>
+      <w:r>
+        <w:rPr>
+          <w:rFonts w:ascii="Calibri" w:hAnsi="Calibri" w:cs="Calibri"/>
+          <w:lang w:val="en-GB"/>
+        </w:rPr>
+        <w:lastRenderedPageBreak/>
+        <w:t>of the temporal world”.</w:t>
       </w:r>
       <w:r>
         <w:rPr>
@@ -5826,15 +5899,7 @@
           <w:rFonts w:ascii="Calibri" w:hAnsi="Calibri" w:cs="Calibri"/>
           <w:lang w:val="en-GB"/>
         </w:rPr>
-        <w:t xml:space="preserve"> Philosophy cannot do this without taking up a position that </w:t>
-      </w:r>
-      <w:r>
-        <w:rPr>
-          <w:rFonts w:ascii="Calibri" w:hAnsi="Calibri" w:cs="Calibri"/>
-          <w:lang w:val="en-GB"/>
-        </w:rPr>
-        <w:lastRenderedPageBreak/>
-        <w:t>transcends the plurality of modal aspects. Only from the “Archimedean point of philosophy” can we come to an understanding of the interconnectedness of the different aspects of reality</w:t>
+        <w:t xml:space="preserve"> Philosophy cannot do this without taking up a position that transcends the plurality of modal aspects. Only from the “Archimedean point of philosophy” can we come to an understanding of the interconnectedness of the different aspects of reality</w:t>
       </w:r>
       <w:r>
         <w:rPr>
@@ -6723,7 +6788,35 @@
           <w:rFonts w:ascii="Calibri" w:hAnsi="Calibri" w:cs="Calibri"/>
           <w:lang w:val="en-GB"/>
         </w:rPr>
-        <w:t xml:space="preserve"> In its Faustian urge to subject the world, the ideal of personality created the</w:t>
+        <w:t xml:space="preserve"> In its Faustian </w:t>
+      </w:r>
+      <w:r>
+        <w:rPr>
+          <w:rFonts w:ascii="Calibri" w:hAnsi="Calibri" w:cs="Calibri"/>
+          <w:lang w:val="en-GB"/>
+        </w:rPr>
+        <w:t>urge</w:t>
+      </w:r>
+      <w:r>
+        <w:rPr>
+          <w:rFonts w:ascii="Calibri" w:hAnsi="Calibri" w:cs="Calibri"/>
+          <w:lang w:val="en-GB"/>
+        </w:rPr>
+        <w:t xml:space="preserve"> to subject the world</w:t>
+      </w:r>
+      <w:r>
+        <w:rPr>
+          <w:rFonts w:ascii="Calibri" w:hAnsi="Calibri" w:cs="Calibri"/>
+          <w:lang w:val="en-GB"/>
+        </w:rPr>
+        <w:t xml:space="preserve"> to its will</w:t>
+      </w:r>
+      <w:r>
+        <w:rPr>
+          <w:rFonts w:ascii="Calibri" w:hAnsi="Calibri" w:cs="Calibri"/>
+          <w:lang w:val="en-GB"/>
+        </w:rPr>
+        <w:t>, the ideal of personality created the</w:t>
       </w:r>
       <w:r>
         <w:rPr>
@@ -6939,6 +7032,7 @@
           <w:rFonts w:ascii="Calibri" w:hAnsi="Calibri" w:cs="Calibri"/>
           <w:lang w:val="en-GB"/>
         </w:rPr>
+        <w:lastRenderedPageBreak/>
         <w:tab/>
         <w:t>In what manner</w:t>
       </w:r>
@@ -6977,15 +7071,7 @@
           <w:rFonts w:ascii="Calibri" w:hAnsi="Calibri" w:cs="Calibri"/>
           <w:lang w:val="en-GB"/>
         </w:rPr>
-        <w:t xml:space="preserve"> advantageous over the humanist philosophy of immanence? It is here that we reach what is perhaps the most </w:t>
-      </w:r>
-      <w:r>
-        <w:rPr>
-          <w:rFonts w:ascii="Calibri" w:hAnsi="Calibri" w:cs="Calibri"/>
-          <w:lang w:val="en-GB"/>
-        </w:rPr>
-        <w:lastRenderedPageBreak/>
-        <w:t xml:space="preserve">original element of </w:t>
+        <w:t xml:space="preserve"> advantageous over the humanist philosophy of immanence? It is here that we reach what is perhaps the most original element of </w:t>
       </w:r>
       <w:proofErr w:type="spellStart"/>
       <w:r>
@@ -7838,7 +7924,15 @@
           <w:rFonts w:ascii="Calibri" w:hAnsi="Calibri" w:cs="Calibri"/>
           <w:lang w:val="en-GB"/>
         </w:rPr>
-        <w:t xml:space="preserve"> It might be objected that many of the ‘humanist’ philosophers actually do have a concept of transcendence and even of God. However, for </w:t>
+        <w:t xml:space="preserve"> It might be objected that many of the ‘humanist’ philosophers actually do have a concept of transcendence and even </w:t>
+      </w:r>
+      <w:r>
+        <w:rPr>
+          <w:rFonts w:ascii="Calibri" w:hAnsi="Calibri" w:cs="Calibri"/>
+          <w:lang w:val="en-GB"/>
+        </w:rPr>
+        <w:lastRenderedPageBreak/>
+        <w:t xml:space="preserve">of God. However, for </w:t>
       </w:r>
       <w:proofErr w:type="spellStart"/>
       <w:r>
@@ -7868,15 +7962,7 @@
           <w:rFonts w:ascii="Calibri" w:hAnsi="Calibri" w:cs="Calibri"/>
           <w:lang w:val="en-GB"/>
         </w:rPr>
-        <w:t xml:space="preserve"> of the mathematical </w:t>
-      </w:r>
-      <w:r>
-        <w:rPr>
-          <w:rFonts w:ascii="Calibri" w:hAnsi="Calibri" w:cs="Calibri"/>
-          <w:lang w:val="en-GB"/>
-        </w:rPr>
-        <w:lastRenderedPageBreak/>
-        <w:t xml:space="preserve">principle </w:t>
+        <w:t xml:space="preserve"> of the mathematical principle </w:t>
       </w:r>
       <w:r>
         <w:rPr>
@@ -8112,7 +8198,7 @@
           <w:rFonts w:ascii="Calibri" w:hAnsi="Calibri" w:cs="Calibri"/>
           <w:lang w:val="en-GB"/>
         </w:rPr>
-        <w:t>we do not yet distinguish between the different modal aspects. We experience the three as an individual thing. Only upon theoretical reflection do we start to see that it has a numerical side</w:t>
+        <w:t>we do not yet distinguish between the different modal aspects. We experience the tree as an individual thing. Only upon theoretical reflection do we start to see that it has a numerical side</w:t>
       </w:r>
       <w:r>
         <w:rPr>
@@ -8847,7 +8933,7 @@
           <w:rFonts w:ascii="Calibri" w:hAnsi="Calibri" w:cs="Calibri"/>
           <w:lang w:val="en-GB"/>
         </w:rPr>
-        <w:t xml:space="preserve"> The state, as all other ‘things’, reflects all modal aspects simultaneously; its unique character, however, is determined by the specific way it relates to different modal aspects. Without going too much </w:t>
+        <w:t xml:space="preserve"> The state, as all other </w:t>
       </w:r>
       <w:r>
         <w:rPr>
@@ -8855,7 +8941,7 @@
           <w:lang w:val="en-GB"/>
         </w:rPr>
         <w:lastRenderedPageBreak/>
-        <w:t xml:space="preserve">into detail here, </w:t>
+        <w:t xml:space="preserve">‘things’, reflects all modal aspects simultaneously; its unique character, however, is determined by the specific way it relates to different modal aspects. Without going too much into detail here, </w:t>
       </w:r>
       <w:r>
         <w:rPr>
@@ -9590,7 +9676,7 @@
           <w:rFonts w:ascii="Calibri" w:hAnsi="Calibri" w:cs="Calibri"/>
           <w:lang w:val="en-GB"/>
         </w:rPr>
-        <w:t>“There, a different authority reigns, that (…) descends from God</w:t>
+        <w:t>“There, a different authority reigns, that … descends from God</w:t>
       </w:r>
       <w:r>
         <w:rPr>
@@ -9970,6 +10056,7 @@
           <w:rFonts w:ascii="Calibri" w:hAnsi="Calibri" w:cs="Calibri"/>
           <w:lang w:val="en-GB"/>
         </w:rPr>
+        <w:lastRenderedPageBreak/>
         <w:tab/>
       </w:r>
       <w:r>
@@ -10012,15 +10099,7 @@
           <w:rFonts w:ascii="Calibri" w:hAnsi="Calibri" w:cs="Calibri"/>
           <w:lang w:val="en-GB"/>
         </w:rPr>
-        <w:t xml:space="preserve"> This is what constitutes the difference between a Calvinist state of law and an </w:t>
-      </w:r>
-      <w:r>
-        <w:rPr>
-          <w:rFonts w:ascii="Calibri" w:hAnsi="Calibri" w:cs="Calibri"/>
-          <w:lang w:val="en-GB"/>
-        </w:rPr>
-        <w:lastRenderedPageBreak/>
-        <w:t xml:space="preserve">absolutist state of power: the latter possesses the competence to determine the limits of its own competences, known as </w:t>
+        <w:t xml:space="preserve"> This is what constitutes the difference between a Calvinist state of law and an absolutist state of power: the latter possesses the competence to determine the limits of its own competences, known as </w:t>
       </w:r>
       <w:proofErr w:type="spellStart"/>
       <w:r>
@@ -10254,7 +10333,21 @@
           <w:rFonts w:ascii="Calibri" w:hAnsi="Calibri" w:cs="Calibri"/>
           <w:lang w:val="en-GB"/>
         </w:rPr>
-        <w:t>ch is as much in breach with sphere sovereignty on the side of the church as is absolutism on the side of the state.</w:t>
+        <w:t xml:space="preserve">ch is as much in breach </w:t>
+      </w:r>
+      <w:r>
+        <w:rPr>
+          <w:rFonts w:ascii="Calibri" w:hAnsi="Calibri" w:cs="Calibri"/>
+          <w:lang w:val="en-GB"/>
+        </w:rPr>
+        <w:t>of</w:t>
+      </w:r>
+      <w:r>
+        <w:rPr>
+          <w:rFonts w:ascii="Calibri" w:hAnsi="Calibri" w:cs="Calibri"/>
+          <w:lang w:val="en-GB"/>
+        </w:rPr>
+        <w:t xml:space="preserve"> sphere sovereignty on the side of the church as is absolutism on the side of the state.</w:t>
       </w:r>
       <w:r>
         <w:rPr>
@@ -10451,7 +10544,21 @@
           <w:rFonts w:ascii="Calibri" w:hAnsi="Calibri" w:cs="Calibri"/>
           <w:lang w:val="en-GB"/>
         </w:rPr>
-        <w:t>find their unity of origin and their self-sufficient fulness of being”.</w:t>
+        <w:t>find their unity of origin and their self-sufficient fulness</w:t>
+      </w:r>
+      <w:r>
+        <w:rPr>
+          <w:rFonts w:ascii="Calibri" w:hAnsi="Calibri" w:cs="Calibri"/>
+          <w:lang w:val="en-GB"/>
+        </w:rPr>
+        <w:t xml:space="preserve"> [sic]</w:t>
+      </w:r>
+      <w:r>
+        <w:rPr>
+          <w:rFonts w:ascii="Calibri" w:hAnsi="Calibri" w:cs="Calibri"/>
+          <w:lang w:val="en-GB"/>
+        </w:rPr>
+        <w:t xml:space="preserve"> of being”.</w:t>
       </w:r>
       <w:r>
         <w:rPr>
@@ -10483,7 +10590,21 @@
           <w:rFonts w:ascii="Calibri" w:hAnsi="Calibri" w:cs="Calibri"/>
           <w:lang w:val="en-GB"/>
         </w:rPr>
-        <w:t xml:space="preserve">This political theory is Calvinist because it departs from the Calvinist idea of a radically transcendent creator God. This premise precludes the </w:t>
+        <w:t xml:space="preserve">This political theory is Calvinist because it </w:t>
+      </w:r>
+      <w:r>
+        <w:rPr>
+          <w:rFonts w:ascii="Calibri" w:hAnsi="Calibri" w:cs="Calibri"/>
+          <w:lang w:val="en-GB"/>
+        </w:rPr>
+        <w:t>starts with</w:t>
+      </w:r>
+      <w:r>
+        <w:rPr>
+          <w:rFonts w:ascii="Calibri" w:hAnsi="Calibri" w:cs="Calibri"/>
+          <w:lang w:val="en-GB"/>
+        </w:rPr>
+        <w:t xml:space="preserve"> the Calvinist idea of a radically transcendent creator God. This premise precludes the </w:t>
       </w:r>
       <w:r>
         <w:rPr>
@@ -10655,7 +10776,21 @@
           <w:rFonts w:ascii="Calibri" w:hAnsi="Calibri" w:cs="Calibri"/>
           <w:lang w:val="en-GB"/>
         </w:rPr>
-        <w:t xml:space="preserve"> nothing more than the absolutization of an </w:t>
+        <w:t xml:space="preserve"> nothing more than the absolutization of</w:t>
+      </w:r>
+      <w:r>
+        <w:rPr>
+          <w:rFonts w:ascii="Calibri" w:hAnsi="Calibri" w:cs="Calibri"/>
+          <w:lang w:val="en-GB"/>
+        </w:rPr>
+        <w:t xml:space="preserve"> a</w:t>
+      </w:r>
+      <w:r>
+        <w:rPr>
+          <w:rFonts w:ascii="Calibri" w:hAnsi="Calibri" w:cs="Calibri"/>
+          <w:lang w:val="en-GB"/>
+        </w:rPr>
+        <w:t xml:space="preserve"> </w:t>
       </w:r>
       <w:r>
         <w:rPr>
@@ -11177,7 +11312,15 @@
           <w:rFonts w:ascii="Calibri" w:hAnsi="Calibri" w:cs="Calibri"/>
           <w:lang w:val="en-GB"/>
         </w:rPr>
-        <w:t xml:space="preserve">nly by accepting dependence of the world, </w:t>
+        <w:t xml:space="preserve">nly by </w:t>
+      </w:r>
+      <w:r>
+        <w:rPr>
+          <w:rFonts w:ascii="Calibri" w:hAnsi="Calibri" w:cs="Calibri"/>
+          <w:lang w:val="en-GB"/>
+        </w:rPr>
+        <w:lastRenderedPageBreak/>
+        <w:t xml:space="preserve">accepting dependence of the world, </w:t>
       </w:r>
       <w:r>
         <w:rPr>
@@ -11191,15 +11334,7 @@
           <w:rFonts w:ascii="Calibri" w:hAnsi="Calibri" w:cs="Calibri"/>
           <w:lang w:val="en-GB"/>
         </w:rPr>
-        <w:t xml:space="preserve">, and political sovereignty on a transcendent </w:t>
-      </w:r>
-      <w:r>
-        <w:rPr>
-          <w:rFonts w:ascii="Calibri" w:hAnsi="Calibri" w:cs="Calibri"/>
-          <w:lang w:val="en-GB"/>
-        </w:rPr>
-        <w:lastRenderedPageBreak/>
-        <w:t xml:space="preserve">creator God, can we come </w:t>
+        <w:t xml:space="preserve">, and political sovereignty on a transcendent creator God, can we come </w:t>
       </w:r>
       <w:r>
         <w:rPr>
@@ -11978,23 +12113,7 @@
           <w:rFonts w:ascii="Calibri" w:hAnsi="Calibri" w:cs="Calibri"/>
           <w:lang w:val="en-GB"/>
         </w:rPr>
-        <w:t xml:space="preserve"> </w:t>
-      </w:r>
-      <w:proofErr w:type="spellStart"/>
-      <w:r>
-        <w:rPr>
-          <w:rFonts w:ascii="Calibri" w:hAnsi="Calibri" w:cs="Calibri"/>
-          <w:lang w:val="en-GB"/>
-        </w:rPr>
-        <w:t>Dooyeweerd’s</w:t>
-      </w:r>
-      <w:proofErr w:type="spellEnd"/>
-      <w:r>
-        <w:rPr>
-          <w:rFonts w:ascii="Calibri" w:hAnsi="Calibri" w:cs="Calibri"/>
-          <w:lang w:val="en-GB"/>
-        </w:rPr>
-        <w:t xml:space="preserve"> philosophy was developed to relative completion in his three-volume magnum opus </w:t>
+        <w:t xml:space="preserve"> Dooyeweerd’s philosophy was developed to relative completion in his three-volume magnum opus </w:t>
       </w:r>
       <w:r>
         <w:rPr>
@@ -12003,47 +12122,7 @@
           <w:iCs/>
           <w:lang w:val="en-GB"/>
         </w:rPr>
-        <w:t xml:space="preserve">De </w:t>
-      </w:r>
-      <w:proofErr w:type="spellStart"/>
-      <w:r>
-        <w:rPr>
-          <w:rFonts w:ascii="Calibri" w:hAnsi="Calibri" w:cs="Calibri"/>
-          <w:i/>
-          <w:iCs/>
-          <w:lang w:val="en-GB"/>
-        </w:rPr>
-        <w:t>Wijsbegeerte</w:t>
-      </w:r>
-      <w:proofErr w:type="spellEnd"/>
-      <w:r>
-        <w:rPr>
-          <w:rFonts w:ascii="Calibri" w:hAnsi="Calibri" w:cs="Calibri"/>
-          <w:i/>
-          <w:iCs/>
-          <w:lang w:val="en-GB"/>
-        </w:rPr>
-        <w:t xml:space="preserve"> der </w:t>
-      </w:r>
-      <w:proofErr w:type="spellStart"/>
-      <w:r>
-        <w:rPr>
-          <w:rFonts w:ascii="Calibri" w:hAnsi="Calibri" w:cs="Calibri"/>
-          <w:i/>
-          <w:iCs/>
-          <w:lang w:val="en-GB"/>
-        </w:rPr>
-        <w:t>Wetsidee</w:t>
-      </w:r>
-      <w:proofErr w:type="spellEnd"/>
-      <w:r>
-        <w:rPr>
-          <w:rFonts w:ascii="Calibri" w:hAnsi="Calibri" w:cs="Calibri"/>
-          <w:i/>
-          <w:iCs/>
-          <w:lang w:val="en-GB"/>
-        </w:rPr>
-        <w:t>.</w:t>
+        <w:t>De Wijsbegeerte der Wetsidee.</w:t>
       </w:r>
       <w:r>
         <w:rPr>
@@ -12184,23 +12263,13 @@
         </w:rPr>
         <w:t xml:space="preserve"> </w:t>
       </w:r>
-      <w:proofErr w:type="spellStart"/>
-      <w:r>
-        <w:rPr>
-          <w:rFonts w:ascii="Calibri" w:hAnsi="Calibri" w:cs="Calibri"/>
-          <w:kern w:val="0"/>
-          <w:lang w:val="en-GB"/>
-        </w:rPr>
-        <w:t>Dooyeweerd</w:t>
-      </w:r>
-      <w:proofErr w:type="spellEnd"/>
-      <w:r>
-        <w:rPr>
-          <w:rFonts w:ascii="Calibri" w:hAnsi="Calibri" w:cs="Calibri"/>
-          <w:kern w:val="0"/>
-          <w:lang w:val="en-GB"/>
-        </w:rPr>
-        <w:t xml:space="preserve">, </w:t>
+      <w:r>
+        <w:rPr>
+          <w:rFonts w:ascii="Calibri" w:hAnsi="Calibri" w:cs="Calibri"/>
+          <w:kern w:val="0"/>
+          <w:lang w:val="en-GB"/>
+        </w:rPr>
+        <w:t xml:space="preserve">Dooyeweerd, </w:t>
       </w:r>
       <w:r>
         <w:rPr>
@@ -12415,25 +12484,7 @@
           <w:kern w:val="0"/>
           <w:lang w:val="en-GB"/>
         </w:rPr>
-        <w:t xml:space="preserve">Guillaume Groen van </w:t>
-      </w:r>
-      <w:proofErr w:type="spellStart"/>
-      <w:r>
-        <w:rPr>
-          <w:rFonts w:ascii="Calibri" w:hAnsi="Calibri" w:cs="Calibri"/>
-          <w:kern w:val="0"/>
-          <w:lang w:val="en-GB"/>
-        </w:rPr>
-        <w:t>Prinsterer</w:t>
-      </w:r>
-      <w:proofErr w:type="spellEnd"/>
-      <w:r>
-        <w:rPr>
-          <w:rFonts w:ascii="Calibri" w:hAnsi="Calibri" w:cs="Calibri"/>
-          <w:kern w:val="0"/>
-          <w:lang w:val="en-GB"/>
-        </w:rPr>
-        <w:t xml:space="preserve">, </w:t>
+        <w:t xml:space="preserve">Guillaume Groen van Prinsterer, </w:t>
       </w:r>
       <w:r>
         <w:rPr>
@@ -12461,23 +12512,13 @@
         </w:rPr>
         <w:t xml:space="preserve">Bellingham: </w:t>
       </w:r>
-      <w:proofErr w:type="spellStart"/>
-      <w:r>
-        <w:rPr>
-          <w:rFonts w:ascii="Calibri" w:hAnsi="Calibri" w:cs="Calibri"/>
-          <w:kern w:val="0"/>
-          <w:lang w:val="en-GB"/>
-        </w:rPr>
-        <w:t>Lexham</w:t>
-      </w:r>
-      <w:proofErr w:type="spellEnd"/>
-      <w:r>
-        <w:rPr>
-          <w:rFonts w:ascii="Calibri" w:hAnsi="Calibri" w:cs="Calibri"/>
-          <w:kern w:val="0"/>
-          <w:lang w:val="en-GB"/>
-        </w:rPr>
-        <w:t xml:space="preserve"> Press, 2018).</w:t>
+      <w:r>
+        <w:rPr>
+          <w:rFonts w:ascii="Calibri" w:hAnsi="Calibri" w:cs="Calibri"/>
+          <w:kern w:val="0"/>
+          <w:lang w:val="en-GB"/>
+        </w:rPr>
+        <w:t>Lexham Press, 2018).</w:t>
       </w:r>
     </w:p>
   </w:endnote>
@@ -12772,39 +12813,7 @@
           <w:rFonts w:ascii="Calibri" w:hAnsi="Calibri" w:cs="Calibri"/>
           <w:lang w:val="en-GB"/>
         </w:rPr>
-        <w:t xml:space="preserve"> It is Illustrative for the underappreciation of </w:t>
-      </w:r>
-      <w:proofErr w:type="spellStart"/>
-      <w:r>
-        <w:rPr>
-          <w:rFonts w:ascii="Calibri" w:hAnsi="Calibri" w:cs="Calibri"/>
-          <w:lang w:val="en-GB"/>
-        </w:rPr>
-        <w:t>Dooyeweerd</w:t>
-      </w:r>
-      <w:proofErr w:type="spellEnd"/>
-      <w:r>
-        <w:rPr>
-          <w:rFonts w:ascii="Calibri" w:hAnsi="Calibri" w:cs="Calibri"/>
-          <w:lang w:val="en-GB"/>
-        </w:rPr>
-        <w:t xml:space="preserve"> in the Netherlands, that up until today </w:t>
-      </w:r>
-      <w:proofErr w:type="spellStart"/>
-      <w:r>
-        <w:rPr>
-          <w:rFonts w:ascii="Calibri" w:hAnsi="Calibri" w:cs="Calibri"/>
-          <w:lang w:val="en-GB"/>
-        </w:rPr>
-        <w:t>Dooyeweerd’s</w:t>
-      </w:r>
-      <w:proofErr w:type="spellEnd"/>
-      <w:r>
-        <w:rPr>
-          <w:rFonts w:ascii="Calibri" w:hAnsi="Calibri" w:cs="Calibri"/>
-          <w:lang w:val="en-GB"/>
-        </w:rPr>
-        <w:t xml:space="preserve"> works in Dutch can only be found second-hand, while in the </w:t>
+        <w:t xml:space="preserve"> It is Illustrative for the underappreciation of Dooyeweerd in the Netherlands, that up until today Dooyeweerd’s works in Dutch can only be found second-hand, while in the </w:t>
       </w:r>
       <w:r>
         <w:rPr>
@@ -13342,29 +13351,7 @@
           <w:kern w:val="0"/>
           <w:lang w:val="en-GB"/>
         </w:rPr>
-        <w:t xml:space="preserve">Secularization, </w:t>
-      </w:r>
-      <w:proofErr w:type="spellStart"/>
-      <w:r>
-        <w:rPr>
-          <w:rFonts w:ascii="Calibri" w:hAnsi="Calibri" w:cs="Calibri"/>
-          <w:i/>
-          <w:iCs/>
-          <w:kern w:val="0"/>
-          <w:lang w:val="en-GB"/>
-        </w:rPr>
-        <w:t>Desecularization</w:t>
-      </w:r>
-      <w:proofErr w:type="spellEnd"/>
-      <w:r>
-        <w:rPr>
-          <w:rFonts w:ascii="Calibri" w:hAnsi="Calibri" w:cs="Calibri"/>
-          <w:i/>
-          <w:iCs/>
-          <w:kern w:val="0"/>
-          <w:lang w:val="en-GB"/>
-        </w:rPr>
-        <w:t xml:space="preserve"> and Toleration. Cross-Disciplinary Challenges to a Modern Myth</w:t>
+        <w:t>Secularization, Desecularization and Toleration. Cross-Disciplinary Challenges to a Modern Myth</w:t>
       </w:r>
       <w:r>
         <w:rPr>
@@ -13507,27 +13494,7 @@
           <w:iCs/>
           <w:kern w:val="0"/>
         </w:rPr>
-        <w:t xml:space="preserve">Het Calvinisme, oorsprong en waarborg onzer </w:t>
-      </w:r>
-      <w:proofErr w:type="spellStart"/>
-      <w:r>
-        <w:rPr>
-          <w:rFonts w:ascii="Calibri" w:hAnsi="Calibri" w:cs="Calibri"/>
-          <w:i/>
-          <w:iCs/>
-          <w:kern w:val="0"/>
-        </w:rPr>
-        <w:t>constitutioneele</w:t>
-      </w:r>
-      <w:proofErr w:type="spellEnd"/>
-      <w:r>
-        <w:rPr>
-          <w:rFonts w:ascii="Calibri" w:hAnsi="Calibri" w:cs="Calibri"/>
-          <w:i/>
-          <w:iCs/>
-          <w:kern w:val="0"/>
-        </w:rPr>
-        <w:t xml:space="preserve"> vrijheden. Een Nederlandsche gedachte.</w:t>
+        <w:t>Het Calvinisme, oorsprong en waarborg onzer constitutioneele vrijheden. Een Nederlandsche gedachte.</w:t>
       </w:r>
       <w:r>
         <w:rPr>
@@ -13599,39 +13566,7 @@
           <w:rFonts w:ascii="Calibri" w:hAnsi="Calibri" w:cs="Calibri"/>
           <w:kern w:val="0"/>
         </w:rPr>
-        <w:t xml:space="preserve">Harinck, ‘Abraham </w:t>
-      </w:r>
-      <w:proofErr w:type="spellStart"/>
-      <w:r>
-        <w:rPr>
-          <w:rFonts w:ascii="Calibri" w:hAnsi="Calibri" w:cs="Calibri"/>
-          <w:kern w:val="0"/>
-        </w:rPr>
-        <w:t>Kuyper’s</w:t>
-      </w:r>
-      <w:proofErr w:type="spellEnd"/>
-      <w:r>
-        <w:rPr>
-          <w:rFonts w:ascii="Calibri" w:hAnsi="Calibri" w:cs="Calibri"/>
-          <w:kern w:val="0"/>
-        </w:rPr>
-        <w:t xml:space="preserve"> </w:t>
-      </w:r>
-      <w:proofErr w:type="spellStart"/>
-      <w:r>
-        <w:rPr>
-          <w:rFonts w:ascii="Calibri" w:hAnsi="Calibri" w:cs="Calibri"/>
-          <w:kern w:val="0"/>
-        </w:rPr>
-        <w:t>Vision</w:t>
-      </w:r>
-      <w:proofErr w:type="spellEnd"/>
-      <w:r>
-        <w:rPr>
-          <w:rFonts w:ascii="Calibri" w:hAnsi="Calibri" w:cs="Calibri"/>
-          <w:kern w:val="0"/>
-        </w:rPr>
-        <w:t>’,</w:t>
+        <w:t>Harinck, ‘Abraham Kuyper’s Vision’,</w:t>
       </w:r>
       <w:r>
         <w:rPr>
@@ -13969,7 +13904,6 @@
         </w:rPr>
         <w:t xml:space="preserve"> </w:t>
       </w:r>
-      <w:proofErr w:type="spellStart"/>
       <w:r>
         <w:rPr>
           <w:rFonts w:ascii="Calibri" w:hAnsi="Calibri" w:cs="Calibri"/>
@@ -13977,17 +13911,7 @@
           <w:sz w:val="20"/>
           <w:lang w:val="en-GB"/>
         </w:rPr>
-        <w:t>Dooyeweerd</w:t>
-      </w:r>
-      <w:proofErr w:type="spellEnd"/>
-      <w:r>
-        <w:rPr>
-          <w:rFonts w:ascii="Calibri" w:hAnsi="Calibri" w:cs="Calibri"/>
-          <w:kern w:val="0"/>
-          <w:sz w:val="20"/>
-          <w:lang w:val="en-GB"/>
-        </w:rPr>
-        <w:t xml:space="preserve">, </w:t>
+        <w:t xml:space="preserve">Dooyeweerd, </w:t>
       </w:r>
       <w:r>
         <w:rPr>
@@ -14064,23 +13988,7 @@
           <w:rFonts w:ascii="Calibri" w:hAnsi="Calibri" w:cs="Calibri"/>
           <w:kern w:val="0"/>
         </w:rPr>
-        <w:t xml:space="preserve">Herman </w:t>
-      </w:r>
-      <w:proofErr w:type="spellStart"/>
-      <w:r>
-        <w:rPr>
-          <w:rFonts w:ascii="Calibri" w:hAnsi="Calibri" w:cs="Calibri"/>
-          <w:kern w:val="0"/>
-        </w:rPr>
-        <w:t>Dooyeweerd</w:t>
-      </w:r>
-      <w:proofErr w:type="spellEnd"/>
-      <w:r>
-        <w:rPr>
-          <w:rFonts w:ascii="Calibri" w:hAnsi="Calibri" w:cs="Calibri"/>
-          <w:kern w:val="0"/>
-        </w:rPr>
-        <w:t xml:space="preserve">, </w:t>
+        <w:t xml:space="preserve">Herman Dooyeweerd, </w:t>
       </w:r>
       <w:r>
         <w:rPr>
@@ -14231,23 +14139,13 @@
         </w:rPr>
         <w:t xml:space="preserve"> </w:t>
       </w:r>
-      <w:proofErr w:type="spellStart"/>
-      <w:r>
-        <w:rPr>
-          <w:rFonts w:ascii="Calibri" w:hAnsi="Calibri" w:cs="Calibri"/>
-          <w:kern w:val="0"/>
-          <w:lang w:val="en-GB"/>
-        </w:rPr>
-        <w:t>Dooyeweerd</w:t>
-      </w:r>
-      <w:proofErr w:type="spellEnd"/>
-      <w:r>
-        <w:rPr>
-          <w:rFonts w:ascii="Calibri" w:hAnsi="Calibri" w:cs="Calibri"/>
-          <w:kern w:val="0"/>
-          <w:lang w:val="en-GB"/>
-        </w:rPr>
-        <w:t xml:space="preserve">, </w:t>
+      <w:r>
+        <w:rPr>
+          <w:rFonts w:ascii="Calibri" w:hAnsi="Calibri" w:cs="Calibri"/>
+          <w:kern w:val="0"/>
+          <w:lang w:val="en-GB"/>
+        </w:rPr>
+        <w:t xml:space="preserve">Dooyeweerd, </w:t>
       </w:r>
       <w:r>
         <w:rPr>
@@ -14337,23 +14235,7 @@
           <w:rFonts w:ascii="Calibri" w:hAnsi="Calibri" w:cs="Calibri"/>
           <w:lang w:val="en-GB"/>
         </w:rPr>
-        <w:t xml:space="preserve"> </w:t>
-      </w:r>
-      <w:proofErr w:type="spellStart"/>
-      <w:r>
-        <w:rPr>
-          <w:rFonts w:ascii="Calibri" w:hAnsi="Calibri" w:cs="Calibri"/>
-          <w:lang w:val="en-GB"/>
-        </w:rPr>
-        <w:t>Dooyeweerd</w:t>
-      </w:r>
-      <w:proofErr w:type="spellEnd"/>
-      <w:r>
-        <w:rPr>
-          <w:rFonts w:ascii="Calibri" w:hAnsi="Calibri" w:cs="Calibri"/>
-          <w:lang w:val="en-GB"/>
-        </w:rPr>
-        <w:t xml:space="preserve"> uses the term ‘meaning’ for what we generally describe as ‘being’, to emphasize its dependence on and distinctness from God.</w:t>
+        <w:t xml:space="preserve"> Dooyeweerd uses the term ‘meaning’ for what we generally describe as ‘being’, to emphasize its dependence on and distinctness from God.</w:t>
       </w:r>
     </w:p>
   </w:endnote>
@@ -14380,23 +14262,13 @@
         </w:rPr>
         <w:t xml:space="preserve"> </w:t>
       </w:r>
-      <w:proofErr w:type="spellStart"/>
-      <w:r>
-        <w:rPr>
-          <w:rFonts w:ascii="Calibri" w:hAnsi="Calibri" w:cs="Calibri"/>
-          <w:kern w:val="0"/>
-          <w:lang w:val="en-GB"/>
-        </w:rPr>
-        <w:t>Dooyeweerd</w:t>
-      </w:r>
-      <w:proofErr w:type="spellEnd"/>
-      <w:r>
-        <w:rPr>
-          <w:rFonts w:ascii="Calibri" w:hAnsi="Calibri" w:cs="Calibri"/>
-          <w:kern w:val="0"/>
-          <w:lang w:val="en-GB"/>
-        </w:rPr>
-        <w:t xml:space="preserve">, </w:t>
+      <w:r>
+        <w:rPr>
+          <w:rFonts w:ascii="Calibri" w:hAnsi="Calibri" w:cs="Calibri"/>
+          <w:kern w:val="0"/>
+          <w:lang w:val="en-GB"/>
+        </w:rPr>
+        <w:t xml:space="preserve">Dooyeweerd, </w:t>
       </w:r>
       <w:r>
         <w:rPr>
@@ -14688,23 +14560,13 @@
         </w:rPr>
         <w:t xml:space="preserve"> </w:t>
       </w:r>
-      <w:proofErr w:type="spellStart"/>
-      <w:r>
-        <w:rPr>
-          <w:rFonts w:ascii="Calibri" w:hAnsi="Calibri" w:cs="Calibri"/>
-          <w:kern w:val="0"/>
-          <w:lang w:val="en-GB"/>
-        </w:rPr>
-        <w:t>Dooyeweerd</w:t>
-      </w:r>
-      <w:proofErr w:type="spellEnd"/>
-      <w:r>
-        <w:rPr>
-          <w:rFonts w:ascii="Calibri" w:hAnsi="Calibri" w:cs="Calibri"/>
-          <w:kern w:val="0"/>
-          <w:lang w:val="en-GB"/>
-        </w:rPr>
-        <w:t xml:space="preserve">, </w:t>
+      <w:r>
+        <w:rPr>
+          <w:rFonts w:ascii="Calibri" w:hAnsi="Calibri" w:cs="Calibri"/>
+          <w:kern w:val="0"/>
+          <w:lang w:val="en-GB"/>
+        </w:rPr>
+        <w:t xml:space="preserve">Dooyeweerd, </w:t>
       </w:r>
       <w:r>
         <w:rPr>
@@ -14772,61 +14634,14 @@
           <w:iCs/>
           <w:lang w:val="en-GB"/>
         </w:rPr>
-        <w:t xml:space="preserve">De </w:t>
-      </w:r>
-      <w:proofErr w:type="spellStart"/>
-      <w:r>
-        <w:rPr>
-          <w:rFonts w:ascii="Calibri" w:hAnsi="Calibri" w:cs="Calibri"/>
-          <w:i/>
-          <w:iCs/>
-          <w:lang w:val="en-GB"/>
-        </w:rPr>
-        <w:t>Wijsbegeerte</w:t>
-      </w:r>
-      <w:proofErr w:type="spellEnd"/>
-      <w:r>
-        <w:rPr>
-          <w:rFonts w:ascii="Calibri" w:hAnsi="Calibri" w:cs="Calibri"/>
-          <w:i/>
-          <w:iCs/>
-          <w:lang w:val="en-GB"/>
-        </w:rPr>
-        <w:t xml:space="preserve"> der </w:t>
-      </w:r>
-      <w:proofErr w:type="spellStart"/>
-      <w:r>
-        <w:rPr>
-          <w:rFonts w:ascii="Calibri" w:hAnsi="Calibri" w:cs="Calibri"/>
-          <w:i/>
-          <w:iCs/>
-          <w:lang w:val="en-GB"/>
-        </w:rPr>
-        <w:t>Wetsidee</w:t>
-      </w:r>
-      <w:proofErr w:type="spellEnd"/>
-      <w:r>
-        <w:rPr>
-          <w:rFonts w:ascii="Calibri" w:hAnsi="Calibri" w:cs="Calibri"/>
-          <w:lang w:val="en-GB"/>
-        </w:rPr>
-        <w:t xml:space="preserve">, thus translates as ‘The Philosophy of the </w:t>
-      </w:r>
-      <w:proofErr w:type="spellStart"/>
-      <w:r>
-        <w:rPr>
-          <w:rFonts w:ascii="Calibri" w:hAnsi="Calibri" w:cs="Calibri"/>
-          <w:lang w:val="en-GB"/>
-        </w:rPr>
-        <w:t>Cosmonomic</w:t>
-      </w:r>
-      <w:proofErr w:type="spellEnd"/>
-      <w:r>
-        <w:rPr>
-          <w:rFonts w:ascii="Calibri" w:hAnsi="Calibri" w:cs="Calibri"/>
-          <w:lang w:val="en-GB"/>
-        </w:rPr>
-        <w:t xml:space="preserve"> Idea’.</w:t>
+        <w:t>De Wijsbegeerte der Wetsidee</w:t>
+      </w:r>
+      <w:r>
+        <w:rPr>
+          <w:rFonts w:ascii="Calibri" w:hAnsi="Calibri" w:cs="Calibri"/>
+          <w:lang w:val="en-GB"/>
+        </w:rPr>
+        <w:t>, thus translates as ‘The Philosophy of the Cosmonomic Idea’.</w:t>
       </w:r>
     </w:p>
   </w:endnote>
@@ -14853,23 +14668,13 @@
         </w:rPr>
         <w:t xml:space="preserve"> </w:t>
       </w:r>
-      <w:proofErr w:type="spellStart"/>
-      <w:r>
-        <w:rPr>
-          <w:rFonts w:ascii="Calibri" w:hAnsi="Calibri" w:cs="Calibri"/>
-          <w:kern w:val="0"/>
-          <w:lang w:val="en-GB"/>
-        </w:rPr>
-        <w:t>Dooyeweerd</w:t>
-      </w:r>
-      <w:proofErr w:type="spellEnd"/>
-      <w:r>
-        <w:rPr>
-          <w:rFonts w:ascii="Calibri" w:hAnsi="Calibri" w:cs="Calibri"/>
-          <w:kern w:val="0"/>
-          <w:lang w:val="en-GB"/>
-        </w:rPr>
-        <w:t xml:space="preserve">, </w:t>
+      <w:r>
+        <w:rPr>
+          <w:rFonts w:ascii="Calibri" w:hAnsi="Calibri" w:cs="Calibri"/>
+          <w:kern w:val="0"/>
+          <w:lang w:val="en-GB"/>
+        </w:rPr>
+        <w:t xml:space="preserve">Dooyeweerd, </w:t>
       </w:r>
       <w:r>
         <w:rPr>
@@ -14979,23 +14784,13 @@
         </w:rPr>
         <w:t xml:space="preserve"> </w:t>
       </w:r>
-      <w:proofErr w:type="spellStart"/>
-      <w:r>
-        <w:rPr>
-          <w:rFonts w:ascii="Calibri" w:hAnsi="Calibri" w:cs="Calibri"/>
-          <w:kern w:val="0"/>
-          <w:lang w:val="en-GB"/>
-        </w:rPr>
-        <w:t>Dooyeweerd</w:t>
-      </w:r>
-      <w:proofErr w:type="spellEnd"/>
-      <w:r>
-        <w:rPr>
-          <w:rFonts w:ascii="Calibri" w:hAnsi="Calibri" w:cs="Calibri"/>
-          <w:kern w:val="0"/>
-          <w:lang w:val="en-GB"/>
-        </w:rPr>
-        <w:t xml:space="preserve">, </w:t>
+      <w:r>
+        <w:rPr>
+          <w:rFonts w:ascii="Calibri" w:hAnsi="Calibri" w:cs="Calibri"/>
+          <w:kern w:val="0"/>
+          <w:lang w:val="en-GB"/>
+        </w:rPr>
+        <w:t xml:space="preserve">Dooyeweerd, </w:t>
       </w:r>
       <w:r>
         <w:rPr>
@@ -15056,23 +14851,13 @@
         </w:rPr>
         <w:t xml:space="preserve"> </w:t>
       </w:r>
-      <w:proofErr w:type="spellStart"/>
-      <w:r>
-        <w:rPr>
-          <w:rFonts w:ascii="Calibri" w:hAnsi="Calibri" w:cs="Calibri"/>
-          <w:kern w:val="0"/>
-          <w:lang w:val="en-GB"/>
-        </w:rPr>
-        <w:t>Dooyeweerd</w:t>
-      </w:r>
-      <w:proofErr w:type="spellEnd"/>
-      <w:r>
-        <w:rPr>
-          <w:rFonts w:ascii="Calibri" w:hAnsi="Calibri" w:cs="Calibri"/>
-          <w:kern w:val="0"/>
-          <w:lang w:val="en-GB"/>
-        </w:rPr>
-        <w:t xml:space="preserve">, </w:t>
+      <w:r>
+        <w:rPr>
+          <w:rFonts w:ascii="Calibri" w:hAnsi="Calibri" w:cs="Calibri"/>
+          <w:kern w:val="0"/>
+          <w:lang w:val="en-GB"/>
+        </w:rPr>
+        <w:t xml:space="preserve">Dooyeweerd, </w:t>
       </w:r>
       <w:r>
         <w:rPr>
@@ -15141,23 +14926,13 @@
         </w:rPr>
         <w:t>‘</w:t>
       </w:r>
-      <w:proofErr w:type="spellStart"/>
-      <w:r>
-        <w:rPr>
-          <w:rFonts w:ascii="Calibri" w:hAnsi="Calibri" w:cs="Calibri"/>
-          <w:kern w:val="0"/>
-          <w:lang w:val="en-GB"/>
-        </w:rPr>
-        <w:t>Dooyeweerd’s</w:t>
-      </w:r>
-      <w:proofErr w:type="spellEnd"/>
-      <w:r>
-        <w:rPr>
-          <w:rFonts w:ascii="Calibri" w:hAnsi="Calibri" w:cs="Calibri"/>
-          <w:kern w:val="0"/>
-          <w:lang w:val="en-GB"/>
-        </w:rPr>
-        <w:t xml:space="preserve"> societal sphere sovereignty: A theory of differentiated responsibility,” </w:t>
+      <w:r>
+        <w:rPr>
+          <w:rFonts w:ascii="Calibri" w:hAnsi="Calibri" w:cs="Calibri"/>
+          <w:kern w:val="0"/>
+          <w:lang w:val="en-GB"/>
+        </w:rPr>
+        <w:t xml:space="preserve">Dooyeweerd’s societal sphere sovereignty: A theory of differentiated responsibility,” </w:t>
       </w:r>
       <w:r>
         <w:rPr>
@@ -15215,23 +14990,13 @@
         </w:rPr>
         <w:t xml:space="preserve"> </w:t>
       </w:r>
-      <w:proofErr w:type="spellStart"/>
-      <w:r>
-        <w:rPr>
-          <w:rFonts w:ascii="Calibri" w:hAnsi="Calibri" w:cs="Calibri"/>
-          <w:kern w:val="0"/>
-          <w:lang w:val="en-GB"/>
-        </w:rPr>
-        <w:t>Dooyeweerd</w:t>
-      </w:r>
-      <w:proofErr w:type="spellEnd"/>
-      <w:r>
-        <w:rPr>
-          <w:rFonts w:ascii="Calibri" w:hAnsi="Calibri" w:cs="Calibri"/>
-          <w:kern w:val="0"/>
-          <w:lang w:val="en-GB"/>
-        </w:rPr>
-        <w:t xml:space="preserve">, </w:t>
+      <w:r>
+        <w:rPr>
+          <w:rFonts w:ascii="Calibri" w:hAnsi="Calibri" w:cs="Calibri"/>
+          <w:kern w:val="0"/>
+          <w:lang w:val="en-GB"/>
+        </w:rPr>
+        <w:t xml:space="preserve">Dooyeweerd, </w:t>
       </w:r>
       <w:r>
         <w:rPr>
@@ -15308,23 +15073,13 @@
         </w:rPr>
         <w:t xml:space="preserve"> </w:t>
       </w:r>
-      <w:proofErr w:type="spellStart"/>
-      <w:r>
-        <w:rPr>
-          <w:rFonts w:ascii="Calibri" w:hAnsi="Calibri" w:cs="Calibri"/>
-          <w:kern w:val="0"/>
-          <w:lang w:val="en-GB"/>
-        </w:rPr>
-        <w:t>Dooyeweerd</w:t>
-      </w:r>
-      <w:proofErr w:type="spellEnd"/>
-      <w:r>
-        <w:rPr>
-          <w:rFonts w:ascii="Calibri" w:hAnsi="Calibri" w:cs="Calibri"/>
-          <w:kern w:val="0"/>
-          <w:lang w:val="en-GB"/>
-        </w:rPr>
-        <w:t xml:space="preserve">, </w:t>
+      <w:r>
+        <w:rPr>
+          <w:rFonts w:ascii="Calibri" w:hAnsi="Calibri" w:cs="Calibri"/>
+          <w:kern w:val="0"/>
+          <w:lang w:val="en-GB"/>
+        </w:rPr>
+        <w:t xml:space="preserve">Dooyeweerd, </w:t>
       </w:r>
       <w:r>
         <w:rPr>
@@ -15385,23 +15140,13 @@
         </w:rPr>
         <w:t xml:space="preserve"> </w:t>
       </w:r>
-      <w:proofErr w:type="spellStart"/>
-      <w:r>
-        <w:rPr>
-          <w:rFonts w:ascii="Calibri" w:hAnsi="Calibri" w:cs="Calibri"/>
-          <w:kern w:val="0"/>
-          <w:lang w:val="en-GB"/>
-        </w:rPr>
-        <w:t>Dooyeweerd</w:t>
-      </w:r>
-      <w:proofErr w:type="spellEnd"/>
-      <w:r>
-        <w:rPr>
-          <w:rFonts w:ascii="Calibri" w:hAnsi="Calibri" w:cs="Calibri"/>
-          <w:kern w:val="0"/>
-          <w:lang w:val="en-GB"/>
-        </w:rPr>
-        <w:t xml:space="preserve">, </w:t>
+      <w:r>
+        <w:rPr>
+          <w:rFonts w:ascii="Calibri" w:hAnsi="Calibri" w:cs="Calibri"/>
+          <w:kern w:val="0"/>
+          <w:lang w:val="en-GB"/>
+        </w:rPr>
+        <w:t xml:space="preserve">Dooyeweerd, </w:t>
       </w:r>
       <w:r>
         <w:rPr>
@@ -15527,7 +15272,6 @@
         </w:rPr>
         <w:t xml:space="preserve">Max Weber, </w:t>
       </w:r>
-      <w:proofErr w:type="spellStart"/>
       <w:r>
         <w:rPr>
           <w:rFonts w:ascii="Calibri" w:hAnsi="Calibri" w:cs="Calibri"/>
@@ -15536,84 +15280,7 @@
           <w:kern w:val="0"/>
           <w:lang w:val="en-GB"/>
         </w:rPr>
-        <w:t>Gesammelte</w:t>
-      </w:r>
-      <w:proofErr w:type="spellEnd"/>
-      <w:r>
-        <w:rPr>
-          <w:rFonts w:ascii="Calibri" w:hAnsi="Calibri" w:cs="Calibri"/>
-          <w:i/>
-          <w:iCs/>
-          <w:kern w:val="0"/>
-          <w:lang w:val="en-GB"/>
-        </w:rPr>
-        <w:t xml:space="preserve"> </w:t>
-      </w:r>
-      <w:proofErr w:type="spellStart"/>
-      <w:r>
-        <w:rPr>
-          <w:rFonts w:ascii="Calibri" w:hAnsi="Calibri" w:cs="Calibri"/>
-          <w:i/>
-          <w:iCs/>
-          <w:kern w:val="0"/>
-          <w:lang w:val="en-GB"/>
-        </w:rPr>
-        <w:t>Aufsätze</w:t>
-      </w:r>
-      <w:proofErr w:type="spellEnd"/>
-      <w:r>
-        <w:rPr>
-          <w:rFonts w:ascii="Calibri" w:hAnsi="Calibri" w:cs="Calibri"/>
-          <w:i/>
-          <w:iCs/>
-          <w:kern w:val="0"/>
-          <w:lang w:val="en-GB"/>
-        </w:rPr>
-        <w:t xml:space="preserve"> </w:t>
-      </w:r>
-      <w:proofErr w:type="spellStart"/>
-      <w:r>
-        <w:rPr>
-          <w:rFonts w:ascii="Calibri" w:hAnsi="Calibri" w:cs="Calibri"/>
-          <w:i/>
-          <w:iCs/>
-          <w:kern w:val="0"/>
-          <w:lang w:val="en-GB"/>
-        </w:rPr>
-        <w:t>zur</w:t>
-      </w:r>
-      <w:proofErr w:type="spellEnd"/>
-      <w:r>
-        <w:rPr>
-          <w:rFonts w:ascii="Calibri" w:hAnsi="Calibri" w:cs="Calibri"/>
-          <w:i/>
-          <w:iCs/>
-          <w:kern w:val="0"/>
-          <w:lang w:val="en-GB"/>
-        </w:rPr>
-        <w:t xml:space="preserve"> </w:t>
-      </w:r>
-      <w:proofErr w:type="spellStart"/>
-      <w:r>
-        <w:rPr>
-          <w:rFonts w:ascii="Calibri" w:hAnsi="Calibri" w:cs="Calibri"/>
-          <w:i/>
-          <w:iCs/>
-          <w:kern w:val="0"/>
-          <w:lang w:val="en-GB"/>
-        </w:rPr>
-        <w:t>Religionssoziologie</w:t>
-      </w:r>
-      <w:proofErr w:type="spellEnd"/>
-      <w:r>
-        <w:rPr>
-          <w:rFonts w:ascii="Calibri" w:hAnsi="Calibri" w:cs="Calibri"/>
-          <w:i/>
-          <w:iCs/>
-          <w:kern w:val="0"/>
-          <w:lang w:val="en-GB"/>
-        </w:rPr>
-        <w:t xml:space="preserve"> I</w:t>
+        <w:t>Gesammelte Aufsätze zur Religionssoziologie I</w:t>
       </w:r>
       <w:r>
         <w:rPr>
@@ -15695,23 +15362,13 @@
         </w:rPr>
         <w:t xml:space="preserve"> </w:t>
       </w:r>
-      <w:proofErr w:type="spellStart"/>
-      <w:r>
-        <w:rPr>
-          <w:rFonts w:ascii="Calibri" w:hAnsi="Calibri" w:cs="Calibri"/>
-          <w:kern w:val="0"/>
-          <w:lang w:val="en-GB"/>
-        </w:rPr>
-        <w:t>Dooyeweerd</w:t>
-      </w:r>
-      <w:proofErr w:type="spellEnd"/>
-      <w:r>
-        <w:rPr>
-          <w:rFonts w:ascii="Calibri" w:hAnsi="Calibri" w:cs="Calibri"/>
-          <w:kern w:val="0"/>
-          <w:lang w:val="en-GB"/>
-        </w:rPr>
-        <w:t xml:space="preserve">, </w:t>
+      <w:r>
+        <w:rPr>
+          <w:rFonts w:ascii="Calibri" w:hAnsi="Calibri" w:cs="Calibri"/>
+          <w:kern w:val="0"/>
+          <w:lang w:val="en-GB"/>
+        </w:rPr>
+        <w:t xml:space="preserve">Dooyeweerd, </w:t>
       </w:r>
       <w:r>
         <w:rPr>
@@ -15845,55 +15502,7 @@
           <w:rFonts w:ascii="Calibri" w:hAnsi="Calibri" w:cs="Calibri"/>
           <w:kern w:val="0"/>
         </w:rPr>
-        <w:t xml:space="preserve">18; </w:t>
-      </w:r>
-      <w:proofErr w:type="spellStart"/>
-      <w:r>
-        <w:rPr>
-          <w:rFonts w:ascii="Calibri" w:hAnsi="Calibri" w:cs="Calibri"/>
-          <w:kern w:val="0"/>
-        </w:rPr>
-        <w:t>Compare</w:t>
-      </w:r>
-      <w:proofErr w:type="spellEnd"/>
-      <w:r>
-        <w:rPr>
-          <w:rFonts w:ascii="Calibri" w:hAnsi="Calibri" w:cs="Calibri"/>
-          <w:kern w:val="0"/>
-        </w:rPr>
-        <w:t xml:space="preserve"> </w:t>
-      </w:r>
-      <w:proofErr w:type="spellStart"/>
-      <w:r>
-        <w:rPr>
-          <w:rFonts w:ascii="Calibri" w:hAnsi="Calibri" w:cs="Calibri"/>
-          <w:kern w:val="0"/>
-        </w:rPr>
-        <w:t>also</w:t>
-      </w:r>
-      <w:proofErr w:type="spellEnd"/>
-      <w:r>
-        <w:rPr>
-          <w:rFonts w:ascii="Calibri" w:hAnsi="Calibri" w:cs="Calibri"/>
-          <w:kern w:val="0"/>
-        </w:rPr>
-        <w:t xml:space="preserve"> </w:t>
-      </w:r>
-      <w:proofErr w:type="spellStart"/>
-      <w:r>
-        <w:rPr>
-          <w:rFonts w:ascii="Calibri" w:hAnsi="Calibri" w:cs="Calibri"/>
-          <w:kern w:val="0"/>
-        </w:rPr>
-        <w:t>Dooyeweerd</w:t>
-      </w:r>
-      <w:proofErr w:type="spellEnd"/>
-      <w:r>
-        <w:rPr>
-          <w:rFonts w:ascii="Calibri" w:hAnsi="Calibri" w:cs="Calibri"/>
-          <w:kern w:val="0"/>
-        </w:rPr>
-        <w:t xml:space="preserve">, </w:t>
+        <w:t xml:space="preserve">18; Compare also Dooyeweerd, </w:t>
       </w:r>
       <w:r>
         <w:rPr>
@@ -15963,23 +15572,13 @@
         </w:rPr>
         <w:t xml:space="preserve"> </w:t>
       </w:r>
-      <w:proofErr w:type="spellStart"/>
-      <w:r>
-        <w:rPr>
-          <w:rFonts w:ascii="Calibri" w:hAnsi="Calibri" w:cs="Calibri"/>
-          <w:kern w:val="0"/>
-          <w:lang w:val="en-GB"/>
-        </w:rPr>
-        <w:t>Dooyeweerd</w:t>
-      </w:r>
-      <w:proofErr w:type="spellEnd"/>
-      <w:r>
-        <w:rPr>
-          <w:rFonts w:ascii="Calibri" w:hAnsi="Calibri" w:cs="Calibri"/>
-          <w:kern w:val="0"/>
-          <w:lang w:val="en-GB"/>
-        </w:rPr>
-        <w:t xml:space="preserve">, </w:t>
+      <w:r>
+        <w:rPr>
+          <w:rFonts w:ascii="Calibri" w:hAnsi="Calibri" w:cs="Calibri"/>
+          <w:kern w:val="0"/>
+          <w:lang w:val="en-GB"/>
+        </w:rPr>
+        <w:t xml:space="preserve">Dooyeweerd, </w:t>
       </w:r>
       <w:r>
         <w:rPr>
@@ -16131,23 +15730,13 @@
         </w:rPr>
         <w:t xml:space="preserve"> </w:t>
       </w:r>
-      <w:proofErr w:type="spellStart"/>
-      <w:r>
-        <w:rPr>
-          <w:rFonts w:ascii="Calibri" w:hAnsi="Calibri" w:cs="Calibri"/>
-          <w:kern w:val="0"/>
-          <w:lang w:val="en-GB"/>
-        </w:rPr>
-        <w:t>Dooyeweerd</w:t>
-      </w:r>
-      <w:proofErr w:type="spellEnd"/>
-      <w:r>
-        <w:rPr>
-          <w:rFonts w:ascii="Calibri" w:hAnsi="Calibri" w:cs="Calibri"/>
-          <w:kern w:val="0"/>
-          <w:lang w:val="en-GB"/>
-        </w:rPr>
-        <w:t xml:space="preserve">, </w:t>
+      <w:r>
+        <w:rPr>
+          <w:rFonts w:ascii="Calibri" w:hAnsi="Calibri" w:cs="Calibri"/>
+          <w:kern w:val="0"/>
+          <w:lang w:val="en-GB"/>
+        </w:rPr>
+        <w:t xml:space="preserve">Dooyeweerd, </w:t>
       </w:r>
       <w:r>
         <w:rPr>
@@ -16364,23 +15953,13 @@
         </w:rPr>
         <w:t xml:space="preserve"> </w:t>
       </w:r>
-      <w:proofErr w:type="spellStart"/>
-      <w:r>
-        <w:rPr>
-          <w:rFonts w:ascii="Calibri" w:hAnsi="Calibri" w:cs="Calibri"/>
-          <w:kern w:val="0"/>
-          <w:lang w:val="en-GB"/>
-        </w:rPr>
-        <w:t>Dooyeweerd</w:t>
-      </w:r>
-      <w:proofErr w:type="spellEnd"/>
-      <w:r>
-        <w:rPr>
-          <w:rFonts w:ascii="Calibri" w:hAnsi="Calibri" w:cs="Calibri"/>
-          <w:kern w:val="0"/>
-          <w:lang w:val="en-GB"/>
-        </w:rPr>
-        <w:t xml:space="preserve">, </w:t>
+      <w:r>
+        <w:rPr>
+          <w:rFonts w:ascii="Calibri" w:hAnsi="Calibri" w:cs="Calibri"/>
+          <w:kern w:val="0"/>
+          <w:lang w:val="en-GB"/>
+        </w:rPr>
+        <w:t xml:space="preserve">Dooyeweerd, </w:t>
       </w:r>
       <w:r>
         <w:rPr>
@@ -16665,25 +16244,7 @@
           <w:kern w:val="0"/>
           <w:lang w:val="en-GB"/>
         </w:rPr>
-        <w:t xml:space="preserve">21; Compare also </w:t>
-      </w:r>
-      <w:proofErr w:type="spellStart"/>
-      <w:r>
-        <w:rPr>
-          <w:rFonts w:ascii="Calibri" w:hAnsi="Calibri" w:cs="Calibri"/>
-          <w:kern w:val="0"/>
-          <w:lang w:val="en-GB"/>
-        </w:rPr>
-        <w:t>Dooyeweerd</w:t>
-      </w:r>
-      <w:proofErr w:type="spellEnd"/>
-      <w:r>
-        <w:rPr>
-          <w:rFonts w:ascii="Calibri" w:hAnsi="Calibri" w:cs="Calibri"/>
-          <w:kern w:val="0"/>
-          <w:lang w:val="en-GB"/>
-        </w:rPr>
-        <w:t xml:space="preserve">, </w:t>
+        <w:t xml:space="preserve">21; Compare also Dooyeweerd, </w:t>
       </w:r>
       <w:r>
         <w:rPr>
@@ -16786,23 +16347,7 @@
           <w:rFonts w:ascii="Calibri" w:hAnsi="Calibri" w:cs="Calibri"/>
           <w:kern w:val="0"/>
         </w:rPr>
-        <w:t xml:space="preserve">J.H. </w:t>
-      </w:r>
-      <w:proofErr w:type="spellStart"/>
-      <w:r>
-        <w:rPr>
-          <w:rFonts w:ascii="Calibri" w:hAnsi="Calibri" w:cs="Calibri"/>
-          <w:kern w:val="0"/>
-        </w:rPr>
-        <w:t>Kruyt</w:t>
-      </w:r>
-      <w:proofErr w:type="spellEnd"/>
-      <w:r>
-        <w:rPr>
-          <w:rFonts w:ascii="Calibri" w:hAnsi="Calibri" w:cs="Calibri"/>
-          <w:kern w:val="0"/>
-        </w:rPr>
-        <w:t>, 1880).</w:t>
+        <w:t>J.H. Kruyt, 1880).</w:t>
       </w:r>
     </w:p>
   </w:endnote>
@@ -16898,35 +16443,7 @@
         <w:rPr>
           <w:rFonts w:ascii="Calibri" w:hAnsi="Calibri" w:cs="Calibri"/>
         </w:rPr>
-        <w:t xml:space="preserve">12. Original </w:t>
-      </w:r>
-      <w:proofErr w:type="spellStart"/>
-      <w:r>
-        <w:rPr>
-          <w:rFonts w:ascii="Calibri" w:hAnsi="Calibri" w:cs="Calibri"/>
-        </w:rPr>
-        <w:t>text</w:t>
-      </w:r>
-      <w:proofErr w:type="spellEnd"/>
-      <w:r>
-        <w:rPr>
-          <w:rFonts w:ascii="Calibri" w:hAnsi="Calibri" w:cs="Calibri"/>
-        </w:rPr>
-        <w:t xml:space="preserve"> in Dutch: “Dáár </w:t>
-      </w:r>
-      <w:proofErr w:type="spellStart"/>
-      <w:r>
-        <w:rPr>
-          <w:rFonts w:ascii="Calibri" w:hAnsi="Calibri" w:cs="Calibri"/>
-        </w:rPr>
-        <w:t>heerscht</w:t>
-      </w:r>
-      <w:proofErr w:type="spellEnd"/>
-      <w:r>
-        <w:rPr>
-          <w:rFonts w:ascii="Calibri" w:hAnsi="Calibri" w:cs="Calibri"/>
-        </w:rPr>
-        <w:t xml:space="preserve"> een ander gezag, dat (…) uit God nederdaalt, en door haar niet </w:t>
+        <w:t xml:space="preserve">12. Original text in Dutch: “Dáár heerscht een ander gezag, dat (…) uit God nederdaalt, en door haar niet </w:t>
       </w:r>
       <w:r>
         <w:rPr>
@@ -16956,25 +16473,7 @@
           <w:kern w:val="0"/>
           <w:lang w:val="en-GB"/>
         </w:rPr>
-        <w:t xml:space="preserve">The distinction between absolute sovereignty and sphere sovereignty is also made by </w:t>
-      </w:r>
-      <w:proofErr w:type="spellStart"/>
-      <w:r>
-        <w:rPr>
-          <w:rFonts w:ascii="Calibri" w:hAnsi="Calibri" w:cs="Calibri"/>
-          <w:kern w:val="0"/>
-          <w:lang w:val="en-GB"/>
-        </w:rPr>
-        <w:t>Dooyeweerd</w:t>
-      </w:r>
-      <w:proofErr w:type="spellEnd"/>
-      <w:r>
-        <w:rPr>
-          <w:rFonts w:ascii="Calibri" w:hAnsi="Calibri" w:cs="Calibri"/>
-          <w:kern w:val="0"/>
-          <w:lang w:val="en-GB"/>
-        </w:rPr>
-        <w:t xml:space="preserve"> in </w:t>
+        <w:t xml:space="preserve">The distinction between absolute sovereignty and sphere sovereignty is also made by Dooyeweerd in </w:t>
       </w:r>
       <w:r>
         <w:rPr>
@@ -17126,23 +16625,13 @@
         </w:rPr>
         <w:t xml:space="preserve"> </w:t>
       </w:r>
-      <w:proofErr w:type="spellStart"/>
-      <w:r>
-        <w:rPr>
-          <w:rFonts w:ascii="Calibri" w:hAnsi="Calibri" w:cs="Calibri"/>
-          <w:kern w:val="0"/>
-          <w:lang w:val="en-GB"/>
-        </w:rPr>
-        <w:t>Dooyeweerd</w:t>
-      </w:r>
-      <w:proofErr w:type="spellEnd"/>
-      <w:r>
-        <w:rPr>
-          <w:rFonts w:ascii="Calibri" w:hAnsi="Calibri" w:cs="Calibri"/>
-          <w:kern w:val="0"/>
-          <w:lang w:val="en-GB"/>
-        </w:rPr>
-        <w:t xml:space="preserve">, </w:t>
+      <w:r>
+        <w:rPr>
+          <w:rFonts w:ascii="Calibri" w:hAnsi="Calibri" w:cs="Calibri"/>
+          <w:kern w:val="0"/>
+          <w:lang w:val="en-GB"/>
+        </w:rPr>
+        <w:t xml:space="preserve">Dooyeweerd, </w:t>
       </w:r>
       <w:r>
         <w:rPr>
@@ -17406,23 +16895,13 @@
         </w:rPr>
         <w:t xml:space="preserve"> </w:t>
       </w:r>
-      <w:proofErr w:type="spellStart"/>
-      <w:r>
-        <w:rPr>
-          <w:rFonts w:ascii="Calibri" w:hAnsi="Calibri" w:cs="Calibri"/>
-          <w:kern w:val="0"/>
-          <w:lang w:val="en-GB"/>
-        </w:rPr>
-        <w:t>Dooyeweerd</w:t>
-      </w:r>
-      <w:proofErr w:type="spellEnd"/>
-      <w:r>
-        <w:rPr>
-          <w:rFonts w:ascii="Calibri" w:hAnsi="Calibri" w:cs="Calibri"/>
-          <w:kern w:val="0"/>
-          <w:lang w:val="en-GB"/>
-        </w:rPr>
-        <w:t xml:space="preserve">, </w:t>
+      <w:r>
+        <w:rPr>
+          <w:rFonts w:ascii="Calibri" w:hAnsi="Calibri" w:cs="Calibri"/>
+          <w:kern w:val="0"/>
+          <w:lang w:val="en-GB"/>
+        </w:rPr>
+        <w:t xml:space="preserve">Dooyeweerd, </w:t>
       </w:r>
       <w:r>
         <w:rPr>
@@ -17546,27 +17025,7 @@
           <w:iCs/>
           <w:kern w:val="0"/>
         </w:rPr>
-        <w:t xml:space="preserve">Het Calvinisme, oorsprong en waarborg onzer </w:t>
-      </w:r>
-      <w:proofErr w:type="spellStart"/>
-      <w:r>
-        <w:rPr>
-          <w:rFonts w:ascii="Calibri" w:hAnsi="Calibri" w:cs="Calibri"/>
-          <w:i/>
-          <w:iCs/>
-          <w:kern w:val="0"/>
-        </w:rPr>
-        <w:t>constitutioneele</w:t>
-      </w:r>
-      <w:proofErr w:type="spellEnd"/>
-      <w:r>
-        <w:rPr>
-          <w:rFonts w:ascii="Calibri" w:hAnsi="Calibri" w:cs="Calibri"/>
-          <w:i/>
-          <w:iCs/>
-          <w:kern w:val="0"/>
-        </w:rPr>
-        <w:t xml:space="preserve"> vrijheden</w:t>
+        <w:t>Het Calvinisme, oorsprong en waarborg onzer constitutioneele vrijheden</w:t>
       </w:r>
       <w:r>
         <w:rPr>
@@ -17600,39 +17059,7 @@
           <w:rFonts w:ascii="Calibri" w:hAnsi="Calibri" w:cs="Calibri"/>
           <w:lang w:val="en-GB"/>
         </w:rPr>
-        <w:t xml:space="preserve"> The term ‘organic’ was used by </w:t>
-      </w:r>
-      <w:proofErr w:type="spellStart"/>
-      <w:r>
-        <w:rPr>
-          <w:rFonts w:ascii="Calibri" w:hAnsi="Calibri" w:cs="Calibri"/>
-          <w:lang w:val="en-GB"/>
-        </w:rPr>
-        <w:t>Dooyeweerd</w:t>
-      </w:r>
-      <w:proofErr w:type="spellEnd"/>
-      <w:r>
-        <w:rPr>
-          <w:rFonts w:ascii="Calibri" w:hAnsi="Calibri" w:cs="Calibri"/>
-          <w:lang w:val="en-GB"/>
-        </w:rPr>
-        <w:t xml:space="preserve"> in earlier works, but he chose to drop it in later works. </w:t>
-      </w:r>
-      <w:proofErr w:type="spellStart"/>
-      <w:r>
-        <w:rPr>
-          <w:rFonts w:ascii="Calibri" w:hAnsi="Calibri" w:cs="Calibri"/>
-          <w:lang w:val="en-GB"/>
-        </w:rPr>
-        <w:t>Dooyeweerd</w:t>
-      </w:r>
-      <w:proofErr w:type="spellEnd"/>
-      <w:r>
-        <w:rPr>
-          <w:rFonts w:ascii="Calibri" w:hAnsi="Calibri" w:cs="Calibri"/>
-          <w:lang w:val="en-GB"/>
-        </w:rPr>
-        <w:t xml:space="preserve">, </w:t>
+        <w:t xml:space="preserve"> The term ‘organic’ was used by Dooyeweerd in earlier works, but he chose to drop it in later works. Dooyeweerd, </w:t>
       </w:r>
       <w:r>
         <w:rPr>
@@ -17648,23 +17075,7 @@
           <w:rFonts w:ascii="Calibri" w:hAnsi="Calibri" w:cs="Calibri"/>
           <w:lang w:val="en-GB"/>
         </w:rPr>
-        <w:t xml:space="preserve">, pp. </w:t>
-      </w:r>
-      <w:proofErr w:type="spellStart"/>
-      <w:r>
-        <w:rPr>
-          <w:rFonts w:ascii="Calibri" w:hAnsi="Calibri" w:cs="Calibri"/>
-          <w:lang w:val="en-GB"/>
-        </w:rPr>
-        <w:t>i</w:t>
-      </w:r>
-      <w:proofErr w:type="spellEnd"/>
-      <w:r>
-        <w:rPr>
-          <w:rFonts w:ascii="Calibri" w:hAnsi="Calibri" w:cs="Calibri"/>
-          <w:lang w:val="en-GB"/>
-        </w:rPr>
-        <w:t>-ii.</w:t>
+        <w:t>, pp. i-ii.</w:t>
       </w:r>
     </w:p>
   </w:endnote>

</xml_diff>